<commit_message>
Add citations & tidy
</commit_message>
<xml_diff>
--- a/app/data/tab1_landing_page_intro.docx
+++ b/app/data/tab1_landing_page_intro.docx
@@ -220,7 +220,7 @@
           <w:sz w:val="24"/>
           <w:szCs w:val="24"/>
         </w:rPr>
-        <w:t>Zuloaga</w:t>
+        <w:t>Knight</w:t>
       </w:r>
       <w:r>
         <w:rPr>
@@ -1372,9 +1372,34 @@
       <w:pgMar w:top="1440" w:right="1440" w:bottom="1440" w:left="1440" w:header="720" w:footer="720" w:gutter="0"/>
       <w:pgNumType w:start="1"/>
       <w:cols w:space="720"/>
+      <w:type w:val="continuous"/>
     </w:sectPr>
   </w:body>
 </w:document>
+</file>
+
+<file path=word/comments.xml><?xml version="1.0" encoding="utf-8"?>
+<w:comments xmlns:wpc="http://schemas.microsoft.com/office/word/2010/wordprocessingCanvas" xmlns:mo="http://schemas.microsoft.com/office/mac/office/2008/main" xmlns:mc="http://schemas.openxmlformats.org/markup-compatibility/2006" xmlns:mv="urn:schemas-microsoft-com:mac:vml" xmlns:o="urn:schemas-microsoft-com:office:office" xmlns:r="http://schemas.openxmlformats.org/officeDocument/2006/relationships" xmlns:m="http://schemas.openxmlformats.org/officeDocument/2006/math" xmlns:v="urn:schemas-microsoft-com:vml" xmlns:wp14="http://schemas.microsoft.com/office/word/2010/wordprocessingDrawing" xmlns:wp="http://schemas.openxmlformats.org/drawingml/2006/wordprocessingDrawing" xmlns:w10="urn:schemas-microsoft-com:office:word" xmlns:w="http://schemas.openxmlformats.org/wordprocessingml/2006/main" xmlns:w14="http://schemas.microsoft.com/office/word/2010/wordml" xmlns:wpg="http://schemas.microsoft.com/office/word/2010/wordprocessingGroup" xmlns:wpi="http://schemas.microsoft.com/office/word/2010/wordprocessingInk" xmlns:wne="http://schemas.microsoft.com/office/word/2006/wordml" xmlns:wps="http://schemas.microsoft.com/office/word/2010/wordprocessingShape" mc:Ignorable="w14 wp14">
+</w:comments>
+</file>
+
+<file path=word/footnotes.xml><?xml version="1.0" encoding="utf-8"?>
+<w:footnotes xmlns:wpc="http://schemas.microsoft.com/office/word/2010/wordprocessingCanvas" xmlns:mo="http://schemas.microsoft.com/office/mac/office/2008/main" xmlns:mc="http://schemas.openxmlformats.org/markup-compatibility/2006" xmlns:mv="urn:schemas-microsoft-com:mac:vml" xmlns:o="urn:schemas-microsoft-com:office:office" xmlns:r="http://schemas.openxmlformats.org/officeDocument/2006/relationships" xmlns:m="http://schemas.openxmlformats.org/officeDocument/2006/math" xmlns:v="urn:schemas-microsoft-com:vml" xmlns:wp14="http://schemas.microsoft.com/office/word/2010/wordprocessingDrawing" xmlns:wp="http://schemas.openxmlformats.org/drawingml/2006/wordprocessingDrawing" xmlns:w10="urn:schemas-microsoft-com:office:word" xmlns:w="http://schemas.openxmlformats.org/wordprocessingml/2006/main" xmlns:w14="http://schemas.microsoft.com/office/word/2010/wordml" xmlns:wpg="http://schemas.microsoft.com/office/word/2010/wordprocessingGroup" xmlns:wpi="http://schemas.microsoft.com/office/word/2010/wordprocessingInk" xmlns:wne="http://schemas.microsoft.com/office/word/2006/wordml" xmlns:wps="http://schemas.microsoft.com/office/word/2010/wordprocessingShape" mc:Ignorable="w14 wp14">
+  <w:footnote w:type="separator" w:id="-1">
+    <w:p>
+      <w:r>
+        <w:separator/>
+      </w:r>
+    </w:p>
+  </w:footnote>
+  <w:footnote w:type="continuationSeparator" w:id="0">
+    <w:p>
+      <w:r>
+        <w:continuationSeparator/>
+      </w:r>
+    </w:p>
+  </w:footnote>
+</w:footnotes>
 </file>
 
 <file path=word/numbering.xml><?xml version="1.0" encoding="utf-8"?>

</xml_diff>